<commit_message>
Add multi-region reliability check
</commit_message>
<xml_diff>
--- a/paper/kopishynska_small_data_crop_forecasting_reliability.docx
+++ b/paper/kopishynska_small_data_crop_forecasting_reliability.docx
@@ -63,7 +63,7 @@
         <w:pStyle w:val="abstract"/>
       </w:pPr>
       <w:r>
-        <w:t>Abstract. Crop yield forecasting from small official statistics is different from forecasting with dense satellite, field, or weather datasets. The sample is short, temporal leakage is easy to introduce, and a machine-learning model should not be accepted unless it beats transparent baselines. This paper presents a baseline-first and reliability-aware workflow for wheat, maize, and sunflower yield forecasting in Poltava region, Ukraine, using harmonised AgroStats records for 2010-2024. ElasticNet, XGBoost, and LightGBM are compared with naive lag-1, linear-trend, LINEST, and ARIMA baselines under a forward temporal design. The new contribution is a decision layer that recommends ML only when it clears a practical MAE margin over the best baseline and then attaches reliability diagnostics: empirical validation-residual bands, test coverage, feature-group ablation, and compact forecast cards. The workflow recommends FORECAST.LINEAR for wheat (MAE 0.49 t/ha), LightGBM for maize (MAE 0.69 t/ha), and LightGBM for sunflower (MAE 0.04 t/ha). The wheat case is intentionally retained as a negative/control case because the baseline remains safer than ML. The results show that machine learning can help in small official-statistics settings, but only when it is checked against simple baselines and presented with reliability diagnostics.</w:t>
+        <w:t>Abstract. Crop yield forecasting from small official statistics is different from forecasting with dense satellite, field, or weather datasets. The sample is short, temporal leakage is easy to introduce, and a machine-learning model should not be accepted unless it beats transparent baselines. This paper presents a baseline-first and reliability-aware workflow for wheat, maize, and sunflower yield forecasting in Poltava, Vinnytsia, Cherkasy, and national-level Ukraine data, using harmonised AgroStats records for 2010-2024. Poltava is the main case, while the other territories provide an external regional and scale check. ElasticNet, XGBoost, and LightGBM are compared with naive lag-1, linear-trend, LINEST, and ARIMA baselines under a forward temporal design. The new contribution is a decision layer that recommends ML only when it clears a practical MAE margin over the best baseline and then attaches reliability diagnostics: empirical validation-residual bands, test coverage, feature-group ablation, and compact forecast cards. The workflow recommends FORECAST.LINEAR for wheat (MAE 0.49 t/ha), LightGBM for maize (MAE 0.69 t/ha), and LightGBM for sunflower (MAE 0.04 t/ha). The wheat case is intentionally retained as a negative/control case because the baseline remains safer than ML in several territories. Across the external check, ML is recommended in 7 of 12 region-crop cases. The results show that machine learning can help in small official-statistics settings, but only when it is checked against simple baselines and presented with reliability diagnostics.</w:t>
       </w:r>
     </w:p>
     <w:p>
@@ -79,7 +79,7 @@
         <w:pStyle w:val="heading11"/>
       </w:pPr>
       <w:r>
-        <w:t>Introduction</w:t>
+        <w:t>1 Introduction</w:t>
       </w:r>
     </w:p>
     <w:p>
@@ -151,15 +151,71 @@
         <w:pStyle w:val="heading11"/>
       </w:pPr>
       <w:r>
-        <w:t>Materials and Methods</w:t>
-      </w:r>
-    </w:p>
-    <w:p>
-      <w:pPr>
-        <w:pStyle w:val="p1a"/>
-      </w:pPr>
-      <w:r>
-        <w:t>The case study uses official AgroStats records for Poltava region, Ukraine, from 2010 to 2024. The target crops are wheat, maize, and sunflower. The raw data are stored as separate CSV files by crop and indicator. The pipeline loads these files, harmonises crop names and indicators, converts units, and builds one annual crop-level table.</w:t>
+        <w:t>2 Novelty and Contribution</w:t>
+      </w:r>
+    </w:p>
+    <w:p>
+      <w:pPr>
+        <w:pStyle w:val="p1a"/>
+      </w:pPr>
+      <w:r>
+        <w:t>The novelty of the project is not that spreadsheet functions outperform machine learning, and not that one algorithm wins on all crops. Spreadsheet-style baselines are used as control models. Their role is to make the recommendation accountable: if an ML model cannot beat a transparent method by a practical margin, it should not be presented as the recommended forecast.</w:t>
+      </w:r>
+    </w:p>
+    <w:p>
+      <w:pPr>
+        <w:pStyle w:val="p1a"/>
+      </w:pPr>
+      <w:r>
+        <w:t>Compared with the original long manuscript, the new repository adds a decision layer around the models. The output is no longer only a leaderboard of ElasticNet, XGBoost, and LightGBM. It is a baseline-first workflow that produces recommended methods, reliability labels, empirical prediction bands, feature-group diagnostics, and forecast cards. This makes the result easier to defend in a small-data publication.</w:t>
+      </w:r>
+    </w:p>
+    <w:p>
+      <w:pPr>
+        <w:pStyle w:val="p1a"/>
+      </w:pPr>
+      <w:r>
+        <w:t>The multi-region extension strengthens the contribution. The same rule is applied to Poltava, Vinnytsia, Cherkasy, and Ukraine for wheat, maize, and sunflower. This creates 12 region-crop decisions: 7 recommend ML and 5 keep a baseline. The national Ukraine series is treated as a scale check rather than as a direct oblast replicate.</w:t>
+      </w:r>
+    </w:p>
+    <w:p>
+      <w:pPr>
+        <w:pStyle w:val="p1a"/>
+      </w:pPr>
+      <w:r>
+        <w:t>The threshold-sensitivity file tests practical margins of 0.00, 0.03, 0.05, and 0.10 t/ha. In the current run, 3 region-crop decisions change when the margin changes. This is useful evidence for the article because it shows that the recommendation is controlled by an explicit rule, not by a manually chosen story after looking at the results.</w:t>
+      </w:r>
+    </w:p>
+    <w:p>
+      <w:pPr>
+        <w:pStyle w:val="p1a"/>
+      </w:pPr>
+      <w:r>
+        <w:t>The strongest conceptual difference is the treatment of negative cases. Wheat remains a control case in Poltava, Vinnytsia, and Ukraine because the transparent baseline is safer. Cherkasy wheat is different and clears the ML rule. This mixed pattern is more credible than a universal statement that ML is always better.</w:t>
+      </w:r>
+    </w:p>
+    <w:p>
+      <w:pPr>
+        <w:pStyle w:val="p1a"/>
+      </w:pPr>
+      <w:r>
+        <w:t>Maize provides the clearest positive signal. ML is recommended for maize in all four territories, but the reliability label still matters. Poltava maize improves MAE but falls outside the validation-residual scale too often, while Vinnytsia, Cherkasy, and Ukraine are labelled within expected error. This makes the article's claim precise: ML can earn recommendation, but the recommendation is conditional.</w:t>
+      </w:r>
+    </w:p>
+    <w:p>
+      <w:pPr>
+        <w:pStyle w:val="heading11"/>
+      </w:pPr>
+      <w:r>
+        <w:t>3 Materials and Methods</w:t>
+      </w:r>
+    </w:p>
+    <w:p>
+      <w:pPr>
+        <w:pStyle w:val="p1a"/>
+      </w:pPr>
+      <w:r>
+        <w:t>The main case study uses official AgroStats records for Poltava region, Ukraine, from 2010 to 2024. Vinnytsia, Cherkasy, and national-level Ukraine records are added as an external check. The target crops are wheat, maize, and sunflower. The raw data are stored as separate CSV files by crop and indicator. The pipeline loads these files, harmonises crop names and indicators, converts units, and builds one annual crop-level table per territory.</w:t>
       </w:r>
     </w:p>
     <w:p>
@@ -191,7 +247,7 @@
         <w:pStyle w:val="p1a"/>
       </w:pPr>
       <w:r>
-        <w:t>The code is organised as a reproducible pipeline. Running `python run_all.py` loads raw data, builds features, validates the dataset, trains models, computes baselines, runs reliability diagnostics, and exports figures and report tables. The article values are taken from generated CSV files, not copied from manual calculations.</w:t>
+        <w:t>The code is organised as a reproducible pipeline. Running `python run_all.py` loads raw data, builds features, validates the Poltava dataset, trains models, computes baselines, runs reliability diagnostics, and exports figures and report tables. Running `python scripts/run_multi_region.py` repeats the same reliability decision workflow for Poltava, Vinnytsia, Cherkasy, and Ukraine. The article values are taken from generated CSV files, not copied from manual calculations.</w:t>
       </w:r>
     </w:p>
     <w:p>
@@ -231,7 +287,7 @@
         <w:pStyle w:val="heading11"/>
       </w:pPr>
       <w:r>
-        <w:t>Reliability-Aware Forecasting Workflow</w:t>
+        <w:t>4 Reliability-Aware Forecasting Workflow</w:t>
       </w:r>
     </w:p>
     <w:p>
@@ -351,7 +407,7 @@
         <w:pStyle w:val="heading11"/>
       </w:pPr>
       <w:r>
-        <w:t>Experimental Results and Discussion</w:t>
+        <w:t>5 Experimental Results and Discussion</w:t>
       </w:r>
     </w:p>
     <w:p>
@@ -660,7 +716,7 @@
         <w:pStyle w:val="p1a"/>
       </w:pPr>
       <w:r>
-        <w:t>The same logic can be extended without changing the core design. Additional regions would create a panel dataset and allow region-wise reliability summaries. Additional crops would test whether the baseline-first rule is crop-dependent. Additional weather or price variables could be added as new feature groups and evaluated through the same ablation table. The decision layer would remain unchanged.</w:t>
+        <w:t>The same logic can be extended without changing the core design. Additional crops would test whether the baseline-first rule is crop-dependent. Additional weather or price variables could be added as new feature groups and evaluated through the same ablation table. The decision layer would remain unchanged.</w:t>
       </w:r>
     </w:p>
     <w:p>
@@ -739,31 +795,417 @@
         <w:pStyle w:val="heading11"/>
       </w:pPr>
       <w:r>
-        <w:t>Conclusions</w:t>
-      </w:r>
-    </w:p>
-    <w:p>
-      <w:pPr>
-        <w:pStyle w:val="p1a"/>
-      </w:pPr>
-      <w:r>
-        <w:t>The project shows that small official agricultural datasets can support a reproducible forecasting benchmark, but only if evaluation is conservative. The main contribution is the baseline-first and reliability-aware decision layer. It prevents ML from being recommended automatically and makes model uncertainty visible through simple diagnostics.</w:t>
-      </w:r>
-    </w:p>
-    <w:p>
-      <w:pPr>
-        <w:pStyle w:val="p1a"/>
-      </w:pPr>
-      <w:r>
-        <w:t>The final recommendations are crop-specific. Wheat remains better served by a transparent baseline. Maize and sunflower benefit from LightGBM, but maize also receives a reliability warning. This mixed result is stronger than a universal ML-superiority claim because it matches the evidence in the data.</w:t>
-      </w:r>
-    </w:p>
-    <w:p>
-      <w:pPr>
-        <w:pStyle w:val="p1a"/>
-      </w:pPr>
-      <w:r>
-        <w:t>Future work should extend the same workflow to more regions, longer time periods, and a small number of carefully selected exogenous variables. The code is prepared for this because the recommendation tables, forecast cards, diagnostics, and article figures are generated from reproducible scripts.</w:t>
+        <w:t>6 External Regional Check</w:t>
+      </w:r>
+    </w:p>
+    <w:p>
+      <w:pPr>
+        <w:pStyle w:val="p1a"/>
+      </w:pPr>
+      <w:r>
+        <w:t>The external check applies the same decision rule to four territories and three crops, producing 12 comparable decisions. ML is recommended in 7 cases, while 5 cases remain with a baseline. This pattern is important because it avoids the claim that ML automatically dominates small official-statistics datasets.</w:t>
+      </w:r>
+    </w:p>
+    <w:p>
+      <w:pPr>
+        <w:pStyle w:val="p1a"/>
+      </w:pPr>
+      <w:r>
+        <w:t>The regional comparison supports the main article framing. Maize is the most consistent positive ML case: all four territories recommend an ML method, although Poltava maize keeps the warning label outside validation error scale. Wheat is mostly a negative/control case: Poltava, Vinnytsia, and Ukraine keep FORECAST.LINEAR, while Cherkasy wheat recommends LightGBM. Sunflower is mixed: Poltava and Vinnytsia recommend ML, whereas Cherkasy and Ukraine keep ARIMA.</w:t>
+      </w:r>
+    </w:p>
+    <w:p>
+      <w:pPr>
+        <w:pStyle w:val="p1a"/>
+      </w:pPr>
+      <w:r>
+        <w:t>The national Ukraine series behaves more conservatively than the oblast cases. It recommends ML for maize, but keeps baselines for wheat and sunflower. This is not treated as a contradiction. National data aggregate different regional structures, so the result is framed as a scale robustness check rather than as a direct replication of oblast-level dynamics.</w:t>
+      </w:r>
+    </w:p>
+    <w:p>
+      <w:pPr>
+        <w:pStyle w:val="p1a"/>
+      </w:pPr>
+      <w:r>
+        <w:t>The practical value of the external check is reproducibility. A reviewer can inspect whether the same rule gives plausible positive, negative, and mixed cases across multiple official datasets. The result is not a single success story; it is a controlled decision workflow that can say yes, no, or yes-with-warning depending on the crop and territory.</w:t>
+      </w:r>
+    </w:p>
+    <w:p>
+      <w:pPr>
+        <w:pStyle w:val="figurecaption"/>
+      </w:pPr>
+      <w:r>
+        <w:t>Table 1. External regional check generated by the same baseline-first decision rule.</w:t>
+      </w:r>
+    </w:p>
+    <w:tbl>
+      <w:tblPr>
+        <w:tblW w:type="auto" w:w="0"/>
+        <w:tblLook w:firstColumn="1" w:firstRow="1" w:lastColumn="0" w:lastRow="0" w:noHBand="0" w:noVBand="1" w:val="04A0"/>
+      </w:tblPr>
+      <w:tblGrid>
+        <w:gridCol w:w="1729"/>
+        <w:gridCol w:w="1729"/>
+        <w:gridCol w:w="1729"/>
+        <w:gridCol w:w="1729"/>
+      </w:tblGrid>
+      <w:tr>
+        <w:tc>
+          <w:tcPr>
+            <w:tcW w:type="dxa" w:w="1729"/>
+          </w:tcPr>
+          <w:p>
+            <w:r/>
+            <w:r>
+              <w:rPr>
+                <w:b/>
+                <w:sz w:val="14"/>
+              </w:rPr>
+              <w:t>Region</w:t>
+            </w:r>
+          </w:p>
+        </w:tc>
+        <w:tc>
+          <w:tcPr>
+            <w:tcW w:type="dxa" w:w="1729"/>
+          </w:tcPr>
+          <w:p>
+            <w:r/>
+            <w:r>
+              <w:rPr>
+                <w:b/>
+                <w:sz w:val="14"/>
+              </w:rPr>
+              <w:t>Wheat</w:t>
+            </w:r>
+          </w:p>
+        </w:tc>
+        <w:tc>
+          <w:tcPr>
+            <w:tcW w:type="dxa" w:w="1729"/>
+          </w:tcPr>
+          <w:p>
+            <w:r/>
+            <w:r>
+              <w:rPr>
+                <w:b/>
+                <w:sz w:val="14"/>
+              </w:rPr>
+              <w:t>Maize</w:t>
+            </w:r>
+          </w:p>
+        </w:tc>
+        <w:tc>
+          <w:tcPr>
+            <w:tcW w:type="dxa" w:w="1729"/>
+          </w:tcPr>
+          <w:p>
+            <w:r/>
+            <w:r>
+              <w:rPr>
+                <w:b/>
+                <w:sz w:val="14"/>
+              </w:rPr>
+              <w:t>Sunflower</w:t>
+            </w:r>
+          </w:p>
+        </w:tc>
+      </w:tr>
+      <w:tr>
+        <w:tc>
+          <w:tcPr>
+            <w:tcW w:type="dxa" w:w="1729"/>
+          </w:tcPr>
+          <w:p>
+            <w:r/>
+            <w:r>
+              <w:rPr>
+                <w:b w:val="0"/>
+                <w:sz w:val="14"/>
+              </w:rPr>
+              <w:t>Poltava</w:t>
+            </w:r>
+          </w:p>
+        </w:tc>
+        <w:tc>
+          <w:tcPr>
+            <w:tcW w:type="dxa" w:w="1729"/>
+          </w:tcPr>
+          <w:p>
+            <w:r/>
+            <w:r>
+              <w:rPr>
+                <w:b w:val="0"/>
+                <w:sz w:val="14"/>
+              </w:rPr>
+              <w:t>F.LINEAR/base</w:t>
+            </w:r>
+          </w:p>
+        </w:tc>
+        <w:tc>
+          <w:tcPr>
+            <w:tcW w:type="dxa" w:w="1729"/>
+          </w:tcPr>
+          <w:p>
+            <w:r/>
+            <w:r>
+              <w:rPr>
+                <w:b w:val="0"/>
+                <w:sz w:val="14"/>
+              </w:rPr>
+              <w:t>LGBM/warn</w:t>
+            </w:r>
+          </w:p>
+        </w:tc>
+        <w:tc>
+          <w:tcPr>
+            <w:tcW w:type="dxa" w:w="1729"/>
+          </w:tcPr>
+          <w:p>
+            <w:r/>
+            <w:r>
+              <w:rPr>
+                <w:b w:val="0"/>
+                <w:sz w:val="14"/>
+              </w:rPr>
+              <w:t>LGBM/ok</w:t>
+            </w:r>
+          </w:p>
+        </w:tc>
+      </w:tr>
+      <w:tr>
+        <w:tc>
+          <w:tcPr>
+            <w:tcW w:type="dxa" w:w="1729"/>
+          </w:tcPr>
+          <w:p>
+            <w:r/>
+            <w:r>
+              <w:rPr>
+                <w:b w:val="0"/>
+                <w:sz w:val="14"/>
+              </w:rPr>
+              <w:t>Vinnytsia</w:t>
+            </w:r>
+          </w:p>
+        </w:tc>
+        <w:tc>
+          <w:tcPr>
+            <w:tcW w:type="dxa" w:w="1729"/>
+          </w:tcPr>
+          <w:p>
+            <w:r/>
+            <w:r>
+              <w:rPr>
+                <w:b w:val="0"/>
+                <w:sz w:val="14"/>
+              </w:rPr>
+              <w:t>F.LINEAR/base</w:t>
+            </w:r>
+          </w:p>
+        </w:tc>
+        <w:tc>
+          <w:tcPr>
+            <w:tcW w:type="dxa" w:w="1729"/>
+          </w:tcPr>
+          <w:p>
+            <w:r/>
+            <w:r>
+              <w:rPr>
+                <w:b w:val="0"/>
+                <w:sz w:val="14"/>
+              </w:rPr>
+              <w:t>XGB/ok</w:t>
+            </w:r>
+          </w:p>
+        </w:tc>
+        <w:tc>
+          <w:tcPr>
+            <w:tcW w:type="dxa" w:w="1729"/>
+          </w:tcPr>
+          <w:p>
+            <w:r/>
+            <w:r>
+              <w:rPr>
+                <w:b w:val="0"/>
+                <w:sz w:val="14"/>
+              </w:rPr>
+              <w:t>LGBM/ok</w:t>
+            </w:r>
+          </w:p>
+        </w:tc>
+      </w:tr>
+      <w:tr>
+        <w:tc>
+          <w:tcPr>
+            <w:tcW w:type="dxa" w:w="1729"/>
+          </w:tcPr>
+          <w:p>
+            <w:r/>
+            <w:r>
+              <w:rPr>
+                <w:b w:val="0"/>
+                <w:sz w:val="14"/>
+              </w:rPr>
+              <w:t>Cherkasy</w:t>
+            </w:r>
+          </w:p>
+        </w:tc>
+        <w:tc>
+          <w:tcPr>
+            <w:tcW w:type="dxa" w:w="1729"/>
+          </w:tcPr>
+          <w:p>
+            <w:r/>
+            <w:r>
+              <w:rPr>
+                <w:b w:val="0"/>
+                <w:sz w:val="14"/>
+              </w:rPr>
+              <w:t>LGBM/ok</w:t>
+            </w:r>
+          </w:p>
+        </w:tc>
+        <w:tc>
+          <w:tcPr>
+            <w:tcW w:type="dxa" w:w="1729"/>
+          </w:tcPr>
+          <w:p>
+            <w:r/>
+            <w:r>
+              <w:rPr>
+                <w:b w:val="0"/>
+                <w:sz w:val="14"/>
+              </w:rPr>
+              <w:t>XGB/ok</w:t>
+            </w:r>
+          </w:p>
+        </w:tc>
+        <w:tc>
+          <w:tcPr>
+            <w:tcW w:type="dxa" w:w="1729"/>
+          </w:tcPr>
+          <w:p>
+            <w:r/>
+            <w:r>
+              <w:rPr>
+                <w:b w:val="0"/>
+                <w:sz w:val="14"/>
+              </w:rPr>
+              <w:t>ARIMA/base</w:t>
+            </w:r>
+          </w:p>
+        </w:tc>
+      </w:tr>
+      <w:tr>
+        <w:tc>
+          <w:tcPr>
+            <w:tcW w:type="dxa" w:w="1729"/>
+          </w:tcPr>
+          <w:p>
+            <w:r/>
+            <w:r>
+              <w:rPr>
+                <w:b w:val="0"/>
+                <w:sz w:val="14"/>
+              </w:rPr>
+              <w:t>Ukraine</w:t>
+            </w:r>
+          </w:p>
+        </w:tc>
+        <w:tc>
+          <w:tcPr>
+            <w:tcW w:type="dxa" w:w="1729"/>
+          </w:tcPr>
+          <w:p>
+            <w:r/>
+            <w:r>
+              <w:rPr>
+                <w:b w:val="0"/>
+                <w:sz w:val="14"/>
+              </w:rPr>
+              <w:t>F.LINEAR/base</w:t>
+            </w:r>
+          </w:p>
+        </w:tc>
+        <w:tc>
+          <w:tcPr>
+            <w:tcW w:type="dxa" w:w="1729"/>
+          </w:tcPr>
+          <w:p>
+            <w:r/>
+            <w:r>
+              <w:rPr>
+                <w:b w:val="0"/>
+                <w:sz w:val="14"/>
+              </w:rPr>
+              <w:t>ENet/ok</w:t>
+            </w:r>
+          </w:p>
+        </w:tc>
+        <w:tc>
+          <w:tcPr>
+            <w:tcW w:type="dxa" w:w="1729"/>
+          </w:tcPr>
+          <w:p>
+            <w:r/>
+            <w:r>
+              <w:rPr>
+                <w:b w:val="0"/>
+                <w:sz w:val="14"/>
+              </w:rPr>
+              <w:t>ARIMA/base</w:t>
+            </w:r>
+          </w:p>
+        </w:tc>
+      </w:tr>
+    </w:tbl>
+    <w:p>
+      <w:pPr>
+        <w:pStyle w:val="figurecaption"/>
+      </w:pPr>
+      <w:r>
+        <w:t>Table labels: ok - within validation-residual band; warn - outside validation error scale; base - baseline safer.</w:t>
+      </w:r>
+    </w:p>
+    <w:p>
+      <w:pPr>
+        <w:pStyle w:val="p1a"/>
+      </w:pPr>
+      <w:r>
+        <w:t>Cherkasy: 2 ML recommendations and 1 baseline recommendations; mean band coverage 88.9%. Poltava: 2 ML recommendations and 1 baseline recommendations; mean band coverage 66.7%. Ukraine: 1 ML recommendations and 2 baseline recommendations; mean band coverage 77.8%. Vinnytsia: 2 ML recommendations and 1 baseline recommendations; mean band coverage 66.7%.</w:t>
+      </w:r>
+    </w:p>
+    <w:p>
+      <w:pPr>
+        <w:pStyle w:val="heading11"/>
+      </w:pPr>
+      <w:r>
+        <w:t>7 Conclusions</w:t>
+      </w:r>
+    </w:p>
+    <w:p>
+      <w:pPr>
+        <w:pStyle w:val="p1a"/>
+      </w:pPr>
+      <w:r>
+        <w:t>The project shows that small official agricultural datasets can support a reproducible forecasting benchmark, but only if evaluation is conservative. The main contribution is the multi-region baseline-first and reliability-aware decision layer. It prevents ML from being recommended automatically and makes model uncertainty visible through simple diagnostics.</w:t>
+      </w:r>
+    </w:p>
+    <w:p>
+      <w:pPr>
+        <w:pStyle w:val="p1a"/>
+      </w:pPr>
+      <w:r>
+        <w:t>The final recommendations are crop- and territory-specific. Poltava wheat remains better served by a transparent baseline. Poltava maize and sunflower benefit from LightGBM, but maize also receives a reliability warning. Across Poltava, Vinnytsia, Cherkasy, and Ukraine, maize is the most consistent positive ML case, while wheat and sunflower include clear baseline-safe cases.</w:t>
+      </w:r>
+    </w:p>
+    <w:p>
+      <w:pPr>
+        <w:pStyle w:val="p1a"/>
+      </w:pPr>
+      <w:r>
+        <w:t>Future work should extend the same workflow to longer time periods, more crops, and a small number of carefully selected exogenous variables. The code is prepared for this because the recommendation tables, forecast cards, diagnostics, and article figures are generated from reproducible scripts.</w:t>
       </w:r>
     </w:p>
     <w:p>

</xml_diff>